<commit_message>
Add simulation methods document and figures; correct DFT comparison document to v1.1
Co-Authored-By: Claude Sonnet 5.5 <noreply@anthropic.com>
</commit_message>
<xml_diff>
--- a/SERS_Sepsis_Spectral_Library/DFT_vs_Experimental_Comparison_NAM_LPS_LTA.docx
+++ b/SERS_Sepsis_Spectral_Library/DFT_vs_Experimental_Comparison_NAM_LPS_LTA.docx
@@ -29,7 +29,7 @@
           <w:i w:val="0"/>
           <w:sz w:val="18"/>
         </w:rPr>
-        <w:t>SERS Sepsis project, bulk-powder Raman spectral library. Version 1.0, 27 October 2026. Experimental data: library v3.3 reference spectra (glass slide, 785 nm). Simulation data: DFT files held in C:\Users\sukes\Downloads\mtp (listed in Section 9).</w:t>
+        <w:t>SERS Sepsis project, bulk-powder Raman spectral library. Version 1.1, 27 October 2026 (v1.1 corrects the LPS basis set and the LTA fragment charge state). Experimental data: library v3.3 reference spectra (glass slide, 785 nm). Simulation data: DFT files held in C:\Users\sukes\Downloads\mtp (listed in Section 9).</w:t>
       </w:r>
     </w:p>
     <w:tbl>
@@ -715,7 +715,7 @@
               <w:rPr>
                 <w:sz w:val="17"/>
               </w:rPr>
-              <w:t>Three fragments: glycerol-phosphate, D-alanine, N-acetyl-D-glucosamine</w:t>
+              <w:t>Three fragments: glycerol-phosphate (two units, charge -2), D-alanine, N-acetyl-D-glucosamine</w:t>
             </w:r>
           </w:p>
         </w:tc>
@@ -817,7 +817,7 @@
               <w:rPr>
                 <w:sz w:val="17"/>
               </w:rPr>
-              <w:t>Gaussian exports; B3LYP level; basis set Not recorded in the files read</w:t>
+              <w:t>B3LYP/6-31G(d), opt freq=raman scf=tight integral=ultrafine (LPS documentation)</w:t>
             </w:r>
           </w:p>
         </w:tc>
@@ -831,7 +831,7 @@
               <w:rPr>
                 <w:sz w:val="17"/>
               </w:rPr>
-              <w:t>Gaussian 16, B3LYP, 6-31G(d), SMD water, opt + freq=raman</w:t>
+              <w:t>Gaussian 16, B3LYP/6-31G(d), SMD water, opt + freq=raman</w:t>
             </w:r>
           </w:p>
         </w:tc>
@@ -875,7 +875,7 @@
               <w:rPr>
                 <w:sz w:val="17"/>
               </w:rPr>
-              <w:t>Not recorded</w:t>
+              <w:t>Gas phase (no solvent keyword in the documented route)</w:t>
             </w:r>
           </w:p>
         </w:tc>
@@ -3677,7 +3677,7 @@
         <w:pStyle w:val="ListBullet"/>
       </w:pPr>
       <w:r>
-        <w:t>Solid-state effects, harmonic error and the unknown basis set apply as for NAM.</w:t>
+        <w:t>Solid-state effects and harmonic error apply as for NAM. The fragments were calculated at B3LYP/6-31G(d), a smaller basis set than the 6-311++G(d,p) used for NAM.</w:t>
       </w:r>
     </w:p>
     <w:p>
@@ -4253,7 +4253,7 @@
               <w:rPr>
                 <w:sz w:val="15"/>
               </w:rPr>
-              <w:t>Nearest peak is GlcNAc at 1105.9 (14 cm-1). The expected phosphate PO2- stretch is not reproduced by the glycerol-phosphate fragment; the ionisation state of the modelled phosphate is Not recorded.</w:t>
+              <w:t>Nearest peak is GlcNAc at 1105.9 (14 cm-1). The expected phosphate PO2- stretch is not reproduced by the glycerol-phosphate fragment; the modelled phosphates are already ionised (charge -2, implicit water), so the miss is not simply an un-ionised-phosphate artefact.</w:t>
             </w:r>
           </w:p>
         </w:tc>
@@ -4420,7 +4420,7 @@
         <w:pStyle w:val="ListBullet"/>
       </w:pPr>
       <w:r>
-        <w:t>Fragments, not the polymer. A neutral glycerol-phosphate unit cannot represent the charged phosphodiester chain of LTA. Whether the modelled phosphate was protonated or ionised is Not recorded.</w:t>
+        <w:t>Fragments, not the polymer. The glycerol-phosphate fragment is a two-unit dianion (charge -2) in implicit water, which is closer to LTA than a single neutral unit, but it still lacks the long chain, the D-alanine ester links and the counter-ions.</w:t>
       </w:r>
     </w:p>
     <w:p>
@@ -6249,7 +6249,7 @@
         <w:pStyle w:val="ListBullet"/>
       </w:pPr>
       <w:r>
-        <w:t>LPS and LTA calculated modes were taken from the files as supplied; the basis set and protonation state for LPS (and the phosphate state for LTA) are Not recorded there.</w:t>
+        <w:t>LPS and LTA calculated modes were taken from the exported files as supplied. The Gaussian logs for the five LPS fragments and for D-alanine and GlcNAc were not found, so their charge states and atom counts are Not recorded; the levels of theory are as documented. Full simulation details are in Simulation_Methods_and_Spectra_NAM_LPS_LTA.docx.</w:t>
       </w:r>
     </w:p>
     <w:p>

</xml_diff>